<commit_message>
chore: update home page
</commit_message>
<xml_diff>
--- a/public/Abstract_template.docx
+++ b/public/Abstract_template.docx
@@ -843,7 +843,14 @@
           <w:rFonts w:ascii="Times New Roman" w:hAnsi="Times New Roman"/>
           <w:color w:val="000000"/>
         </w:rPr>
-        <w:t>026@nitrkl.ac.in by 20</w:t>
+        <w:t xml:space="preserve">026@nitrkl.ac.in by </w:t>
+      </w:r>
+      <w:r>
+        <w:rPr>
+          <w:rFonts w:ascii="Times New Roman" w:hAnsi="Times New Roman"/>
+          <w:color w:val="000000"/>
+        </w:rPr>
+        <w:t>31</w:t>
       </w:r>
       <w:r>
         <w:rPr>
@@ -851,6 +858,112 @@
           <w:color w:val="000000"/>
           <w:vertAlign w:val="superscript"/>
         </w:rPr>
+        <w:t>st</w:t>
+      </w:r>
+      <w:r>
+        <w:rPr>
+          <w:rFonts w:ascii="Times New Roman" w:hAnsi="Times New Roman"/>
+          <w:color w:val="000000"/>
+        </w:rPr>
+        <w:t xml:space="preserve"> August</w:t>
+      </w:r>
+      <w:r>
+        <w:rPr>
+          <w:rFonts w:ascii="Times New Roman" w:hAnsi="Times New Roman"/>
+          <w:color w:val="000000"/>
+        </w:rPr>
+        <w:t xml:space="preserve"> 2026. </w:t>
+      </w:r>
+      <w:r>
+        <w:rPr>
+          <w:rFonts w:ascii="Times New Roman" w:hAnsi="Times New Roman"/>
+          <w:color w:val="000000"/>
+        </w:rPr>
+        <w:t xml:space="preserve">The </w:t>
+      </w:r>
+      <w:r>
+        <w:rPr>
+          <w:rFonts w:ascii="Times New Roman" w:hAnsi="Times New Roman"/>
+          <w:color w:val="000000"/>
+        </w:rPr>
+        <w:t xml:space="preserve">list of </w:t>
+      </w:r>
+      <w:r>
+        <w:rPr>
+          <w:rFonts w:ascii="Times New Roman" w:hAnsi="Times New Roman"/>
+          <w:color w:val="000000"/>
+        </w:rPr>
+        <w:t>accept</w:t>
+      </w:r>
+      <w:r>
+        <w:rPr>
+          <w:rFonts w:ascii="Times New Roman" w:hAnsi="Times New Roman"/>
+          <w:color w:val="000000"/>
+        </w:rPr>
+        <w:t>ed</w:t>
+      </w:r>
+      <w:r>
+        <w:rPr>
+          <w:rFonts w:ascii="Times New Roman" w:hAnsi="Times New Roman"/>
+          <w:color w:val="000000"/>
+        </w:rPr>
+        <w:t xml:space="preserve"> </w:t>
+      </w:r>
+      <w:r>
+        <w:rPr>
+          <w:rFonts w:ascii="Times New Roman" w:hAnsi="Times New Roman"/>
+          <w:color w:val="000000"/>
+        </w:rPr>
+        <w:t xml:space="preserve">abstracts </w:t>
+      </w:r>
+      <w:r>
+        <w:rPr>
+          <w:rFonts w:ascii="Times New Roman" w:hAnsi="Times New Roman"/>
+          <w:color w:val="000000"/>
+        </w:rPr>
+        <w:t xml:space="preserve">will be </w:t>
+      </w:r>
+      <w:r>
+        <w:rPr>
+          <w:rFonts w:ascii="Times New Roman" w:hAnsi="Times New Roman"/>
+          <w:color w:val="000000"/>
+        </w:rPr>
+        <w:t>uploaded</w:t>
+      </w:r>
+      <w:r>
+        <w:rPr>
+          <w:rFonts w:ascii="Times New Roman" w:hAnsi="Times New Roman"/>
+          <w:color w:val="000000"/>
+        </w:rPr>
+        <w:t xml:space="preserve"> </w:t>
+      </w:r>
+      <w:r>
+        <w:rPr>
+          <w:rFonts w:ascii="Times New Roman" w:hAnsi="Times New Roman"/>
+          <w:color w:val="000000"/>
+        </w:rPr>
+        <w:t xml:space="preserve">by </w:t>
+      </w:r>
+      <w:r>
+        <w:rPr>
+          <w:rFonts w:ascii="Times New Roman" w:hAnsi="Times New Roman"/>
+          <w:color w:val="000000"/>
+        </w:rPr>
+        <w:t>1</w:t>
+      </w:r>
+      <w:r>
+        <w:rPr>
+          <w:rFonts w:ascii="Times New Roman" w:hAnsi="Times New Roman"/>
+          <w:color w:val="000000"/>
+        </w:rPr>
+        <w:t>0</w:t>
+      </w:r>
+      <w:r>
+        <w:rPr>
+          <w:rFonts w:ascii="Times New Roman" w:hAnsi="Times New Roman"/>
+          <w:color w:val="000000"/>
+          <w:vertAlign w:val="superscript"/>
+        </w:rPr>
         <w:t>th</w:t>
       </w:r>
       <w:r>
@@ -858,41 +971,6 @@
           <w:rFonts w:ascii="Times New Roman" w:hAnsi="Times New Roman"/>
           <w:color w:val="000000"/>
         </w:rPr>
-        <w:t xml:space="preserve"> September 2026. </w:t>
-      </w:r>
-      <w:r>
-        <w:rPr>
-          <w:rFonts w:ascii="Times New Roman" w:hAnsi="Times New Roman"/>
-          <w:color w:val="000000"/>
-        </w:rPr>
-        <w:t xml:space="preserve">The </w:t>
-      </w:r>
-      <w:r>
-        <w:rPr>
-          <w:rFonts w:ascii="Times New Roman" w:hAnsi="Times New Roman"/>
-          <w:color w:val="000000"/>
-        </w:rPr>
-        <w:t xml:space="preserve">list of </w:t>
-      </w:r>
-      <w:r>
-        <w:rPr>
-          <w:rFonts w:ascii="Times New Roman" w:hAnsi="Times New Roman"/>
-          <w:color w:val="000000"/>
-        </w:rPr>
-        <w:t>accept</w:t>
-      </w:r>
-      <w:r>
-        <w:rPr>
-          <w:rFonts w:ascii="Times New Roman" w:hAnsi="Times New Roman"/>
-          <w:color w:val="000000"/>
-        </w:rPr>
-        <w:t>ed</w:t>
-      </w:r>
-      <w:r>
-        <w:rPr>
-          <w:rFonts w:ascii="Times New Roman" w:hAnsi="Times New Roman"/>
-          <w:color w:val="000000"/>
-        </w:rPr>
         <w:t xml:space="preserve"> </w:t>
       </w:r>
       <w:r>
@@ -900,21 +978,28 @@
           <w:rFonts w:ascii="Times New Roman" w:hAnsi="Times New Roman"/>
           <w:color w:val="000000"/>
         </w:rPr>
-        <w:t xml:space="preserve">abstracts </w:t>
-      </w:r>
-      <w:r>
-        <w:rPr>
-          <w:rFonts w:ascii="Times New Roman" w:hAnsi="Times New Roman"/>
-          <w:color w:val="000000"/>
-        </w:rPr>
-        <w:t xml:space="preserve">will be </w:t>
-      </w:r>
-      <w:r>
-        <w:rPr>
-          <w:rFonts w:ascii="Times New Roman" w:hAnsi="Times New Roman"/>
-          <w:color w:val="000000"/>
-        </w:rPr>
-        <w:t>uploaded</w:t>
+        <w:t>September</w:t>
+      </w:r>
+      <w:r>
+        <w:rPr>
+          <w:rFonts w:ascii="Times New Roman" w:hAnsi="Times New Roman"/>
+          <w:color w:val="000000"/>
+        </w:rPr>
+        <w:t xml:space="preserve"> 202</w:t>
+      </w:r>
+      <w:r>
+        <w:rPr>
+          <w:rFonts w:ascii="Times New Roman" w:hAnsi="Times New Roman"/>
+          <w:color w:val="000000"/>
+        </w:rPr>
+        <w:t>6</w:t>
+      </w:r>
+      <w:r>
+        <w:rPr>
+          <w:rFonts w:ascii="Times New Roman" w:hAnsi="Times New Roman"/>
+          <w:color w:val="000000"/>
+        </w:rPr>
+        <w:t xml:space="preserve"> at the conference website</w:t>
       </w:r>
       <w:r>
         <w:rPr>
@@ -928,70 +1013,6 @@
           <w:rFonts w:ascii="Times New Roman" w:hAnsi="Times New Roman"/>
           <w:color w:val="000000"/>
         </w:rPr>
-        <w:t xml:space="preserve">by </w:t>
-      </w:r>
-      <w:r>
-        <w:rPr>
-          <w:rFonts w:ascii="Times New Roman" w:hAnsi="Times New Roman"/>
-          <w:color w:val="000000"/>
-        </w:rPr>
-        <w:t>30</w:t>
-      </w:r>
-      <w:r>
-        <w:rPr>
-          <w:rFonts w:ascii="Times New Roman" w:hAnsi="Times New Roman"/>
-          <w:color w:val="000000"/>
-          <w:vertAlign w:val="superscript"/>
-        </w:rPr>
-        <w:t>th</w:t>
-      </w:r>
-      <w:r>
-        <w:rPr>
-          <w:rFonts w:ascii="Times New Roman" w:hAnsi="Times New Roman"/>
-          <w:color w:val="000000"/>
-        </w:rPr>
-        <w:t xml:space="preserve"> </w:t>
-      </w:r>
-      <w:r>
-        <w:rPr>
-          <w:rFonts w:ascii="Times New Roman" w:hAnsi="Times New Roman"/>
-          <w:color w:val="000000"/>
-        </w:rPr>
-        <w:t>September</w:t>
-      </w:r>
-      <w:r>
-        <w:rPr>
-          <w:rFonts w:ascii="Times New Roman" w:hAnsi="Times New Roman"/>
-          <w:color w:val="000000"/>
-        </w:rPr>
-        <w:t xml:space="preserve"> 202</w:t>
-      </w:r>
-      <w:r>
-        <w:rPr>
-          <w:rFonts w:ascii="Times New Roman" w:hAnsi="Times New Roman"/>
-          <w:color w:val="000000"/>
-        </w:rPr>
-        <w:t>6</w:t>
-      </w:r>
-      <w:r>
-        <w:rPr>
-          <w:rFonts w:ascii="Times New Roman" w:hAnsi="Times New Roman"/>
-          <w:color w:val="000000"/>
-        </w:rPr>
-        <w:t xml:space="preserve"> at the conference website</w:t>
-      </w:r>
-      <w:r>
-        <w:rPr>
-          <w:rFonts w:ascii="Times New Roman" w:hAnsi="Times New Roman"/>
-          <w:color w:val="000000"/>
-        </w:rPr>
-        <w:t xml:space="preserve"> </w:t>
-      </w:r>
-      <w:r>
-        <w:rPr>
-          <w:rFonts w:ascii="Times New Roman" w:hAnsi="Times New Roman"/>
-          <w:color w:val="000000"/>
-        </w:rPr>
         <w:t>https://cmdays2026.nitrkl.ac.in/</w:t>
       </w:r>
       <w:r>
@@ -999,7 +1020,7 @@
           <w:rFonts w:ascii="Times New Roman" w:hAnsi="Times New Roman"/>
           <w:color w:val="000000"/>
         </w:rPr>
-        <w:t>. Each pape</w:t>
+        <w:t xml:space="preserve">. </w:t>
       </w:r>
       <w:bookmarkStart w:id="0" w:name="_GoBack"/>
       <w:bookmarkEnd w:id="0"/>
@@ -1008,7 +1029,7 @@
           <w:rFonts w:ascii="Times New Roman" w:hAnsi="Times New Roman"/>
           <w:color w:val="000000"/>
         </w:rPr>
-        <w:t xml:space="preserve">r accepted for presentation must </w:t>
+        <w:t xml:space="preserve">Each paper accepted for presentation must </w:t>
       </w:r>
       <w:r>
         <w:rPr>
@@ -1029,7 +1050,7 @@
           <w:rFonts w:ascii="Times New Roman" w:hAnsi="Times New Roman"/>
           <w:color w:val="000000"/>
         </w:rPr>
-        <w:t>10</w:t>
+        <w:t>20</w:t>
       </w:r>
       <w:r>
         <w:rPr>
@@ -1044,7 +1065,14 @@
           <w:rFonts w:ascii="Times New Roman" w:hAnsi="Times New Roman"/>
           <w:color w:val="000000"/>
         </w:rPr>
-        <w:t xml:space="preserve"> October</w:t>
+        <w:t xml:space="preserve"> </w:t>
+      </w:r>
+      <w:r>
+        <w:rPr>
+          <w:rFonts w:ascii="Times New Roman" w:hAnsi="Times New Roman"/>
+          <w:color w:val="000000"/>
+        </w:rPr>
+        <w:t>September</w:t>
       </w:r>
       <w:r>
         <w:rPr>
@@ -2436,7 +2464,7 @@
   <a:extraClrSchemeLst/>
   <a:extLst>
     <a:ext uri="{05A4C25C-085E-4340-85A3-A5531E510DB2}">
-      <thm15:themeFamily xmlns="" xmlns:thm15="http://schemas.microsoft.com/office/thememl/2012/main" name="Office Theme" id="{62F939B6-93AF-4DB8-9C6B-D6C7DFDC589F}" vid="{4A3C46E8-61CC-4603-A589-7422A47A8E4A}"/>
+      <thm15:themeFamily xmlns:thm15="http://schemas.microsoft.com/office/thememl/2012/main" xmlns="" name="Office Theme" id="{62F939B6-93AF-4DB8-9C6B-D6C7DFDC589F}" vid="{4A3C46E8-61CC-4603-A589-7422A47A8E4A}"/>
     </a:ext>
   </a:extLst>
 </a:theme>

</xml_diff>